<commit_message>
docs: update docx with full tech stack (Vercel, Cloudflare, Supabase, GitHub, reg.ru)
</commit_message>
<xml_diff>
--- a/docs/Naranja_Feliz_Руководство_пользователя.docx
+++ b/docs/Naranja_Feliz_Руководство_пользователя.docx
@@ -3111,26 +3111,47 @@
           <w:sz w:val="22"/>
           <w:szCs w:val="22"/>
         </w:rPr>
-        <w:t xml:space="preserve">Стек технологий:</w:t>
-      </w:r>
-    </w:p>
-    <w:p>
-      <w:pPr>
-        <w:pStyle w:val="ListParagraph"/>
-        <w:numPr>
-          <w:ilvl w:val="0"/>
-          <w:numId w:val="1"/>
-        </w:numPr>
-        <w:spacing w:after="60"/>
-      </w:pPr>
-      <w:r>
-        <w:rPr>
-          <w:rFonts w:ascii="Geist Sans" w:cs="Geist Sans" w:eastAsia="Geist Sans" w:hAnsi="Geist Sans"/>
-          <w:color w:val="1A1A2E"/>
-          <w:sz w:val="22"/>
-          <w:szCs w:val="22"/>
-        </w:rPr>
-        <w:t xml:space="preserve">Next.js 15 (App Router) — серверный рендеринг, API routes</w:t>
+        <w:t xml:space="preserve">Стек технологий и сервисы:</w:t>
+      </w:r>
+    </w:p>
+    <w:p>
+      <w:pPr>
+        <w:spacing w:after="60" w:before="0"/>
+      </w:pPr>
+    </w:p>
+    <w:p>
+      <w:pPr>
+        <w:spacing w:after="120" w:before="0"/>
+      </w:pPr>
+      <w:r>
+        <w:rPr>
+          <w:rFonts w:ascii="Geist Sans" w:cs="Geist Sans" w:eastAsia="Geist Sans" w:hAnsi="Geist Sans"/>
+          <w:b/>
+          <w:bCs/>
+          <w:color w:val="1A1A2E"/>
+          <w:sz w:val="22"/>
+          <w:szCs w:val="22"/>
+        </w:rPr>
+        <w:t xml:space="preserve">Платформа:</w:t>
+      </w:r>
+    </w:p>
+    <w:p>
+      <w:pPr>
+        <w:pStyle w:val="ListParagraph"/>
+        <w:numPr>
+          <w:ilvl w:val="0"/>
+          <w:numId w:val="1"/>
+        </w:numPr>
+        <w:spacing w:after="60"/>
+      </w:pPr>
+      <w:r>
+        <w:rPr>
+          <w:rFonts w:ascii="Geist Sans" w:cs="Geist Sans" w:eastAsia="Geist Sans" w:hAnsi="Geist Sans"/>
+          <w:color w:val="1A1A2E"/>
+          <w:sz w:val="22"/>
+          <w:szCs w:val="22"/>
+        </w:rPr>
+        <w:t xml:space="preserve">Next.js 16 (App Router) — серверный рендеринг, API routes</w:t>
       </w:r>
     </w:p>
     <w:p>
@@ -3187,25 +3208,6 @@
           <w:sz w:val="22"/>
           <w:szCs w:val="22"/>
         </w:rPr>
-        <w:t xml:space="preserve">Supabase — база данных (PostgreSQL), аутентификация, storage, RLS</w:t>
-      </w:r>
-    </w:p>
-    <w:p>
-      <w:pPr>
-        <w:pStyle w:val="ListParagraph"/>
-        <w:numPr>
-          <w:ilvl w:val="0"/>
-          <w:numId w:val="1"/>
-        </w:numPr>
-        <w:spacing w:after="60"/>
-      </w:pPr>
-      <w:r>
-        <w:rPr>
-          <w:rFonts w:ascii="Geist Sans" w:cs="Geist Sans" w:eastAsia="Geist Sans" w:hAnsi="Geist Sans"/>
-          <w:color w:val="1A1A2E"/>
-          <w:sz w:val="22"/>
-          <w:szCs w:val="22"/>
-        </w:rPr>
         <w:t xml:space="preserve">Tailwind CSS v4 — стилизация</w:t>
       </w:r>
     </w:p>
@@ -3225,7 +3227,7 @@
           <w:sz w:val="22"/>
           <w:szCs w:val="22"/>
         </w:rPr>
-        <w:t xml:space="preserve">TipTap.js — WYSIWYG редактор</w:t>
+        <w:t xml:space="preserve">TipTap.js 3.27 — WYSIWYG редактор</w:t>
       </w:r>
     </w:p>
     <w:p>
@@ -3283,6 +3285,400 @@
           <w:szCs w:val="22"/>
         </w:rPr>
         <w:t xml:space="preserve">Web Speech API — озвучка испанского текста</w:t>
+      </w:r>
+    </w:p>
+    <w:p>
+      <w:pPr>
+        <w:spacing w:after="60" w:before="0"/>
+      </w:pPr>
+    </w:p>
+    <w:p>
+      <w:pPr>
+        <w:spacing w:after="120" w:before="0"/>
+      </w:pPr>
+      <w:r>
+        <w:rPr>
+          <w:rFonts w:ascii="Geist Sans" w:cs="Geist Sans" w:eastAsia="Geist Sans" w:hAnsi="Geist Sans"/>
+          <w:b/>
+          <w:bCs/>
+          <w:color w:val="1A1A2E"/>
+          <w:sz w:val="22"/>
+          <w:szCs w:val="22"/>
+        </w:rPr>
+        <w:t xml:space="preserve">Инфраструктура:</w:t>
+      </w:r>
+    </w:p>
+    <w:p>
+      <w:pPr>
+        <w:pStyle w:val="ListParagraph"/>
+        <w:numPr>
+          <w:ilvl w:val="0"/>
+          <w:numId w:val="1"/>
+        </w:numPr>
+        <w:spacing w:after="60"/>
+      </w:pPr>
+      <w:r>
+        <w:rPr>
+          <w:rFonts w:ascii="Geist Sans" w:cs="Geist Sans" w:eastAsia="Geist Sans" w:hAnsi="Geist Sans"/>
+          <w:color w:val="1A1A2E"/>
+          <w:sz w:val="22"/>
+          <w:szCs w:val="22"/>
+        </w:rPr>
+        <w:t xml:space="preserve">GitHub (аккаунт outmilker1978) — хранение кода, Git</w:t>
+      </w:r>
+    </w:p>
+    <w:p>
+      <w:pPr>
+        <w:pStyle w:val="ListParagraph"/>
+        <w:numPr>
+          <w:ilvl w:val="0"/>
+          <w:numId w:val="1"/>
+        </w:numPr>
+        <w:spacing w:after="60"/>
+      </w:pPr>
+      <w:r>
+        <w:rPr>
+          <w:rFonts w:ascii="Geist Sans" w:cs="Geist Sans" w:eastAsia="Geist Sans" w:hAnsi="Geist Sans"/>
+          <w:color w:val="1A1A2E"/>
+          <w:sz w:val="22"/>
+          <w:szCs w:val="22"/>
+        </w:rPr>
+        <w:t xml:space="preserve">Vercel (аккаунт outmilker@gmail.com, GitHub OAuth) — хостинг, SSR, авто-деплой из GitHub</w:t>
+      </w:r>
+    </w:p>
+    <w:p>
+      <w:pPr>
+        <w:pStyle w:val="ListParagraph"/>
+        <w:numPr>
+          <w:ilvl w:val="0"/>
+          <w:numId w:val="1"/>
+        </w:numPr>
+        <w:spacing w:after="60"/>
+      </w:pPr>
+      <w:r>
+        <w:rPr>
+          <w:rFonts w:ascii="Geist Sans" w:cs="Geist Sans" w:eastAsia="Geist Sans" w:hAnsi="Geist Sans"/>
+          <w:color w:val="1A1A2E"/>
+          <w:sz w:val="22"/>
+          <w:szCs w:val="22"/>
+        </w:rPr>
+        <w:t xml:space="preserve">Supabase (аккаунт outmilker@gmail.com) — PostgreSQL БД, аутентификация, файловое хранилище</w:t>
+      </w:r>
+    </w:p>
+    <w:p>
+      <w:pPr>
+        <w:pStyle w:val="ListParagraph"/>
+        <w:numPr>
+          <w:ilvl w:val="0"/>
+          <w:numId w:val="1"/>
+        </w:numPr>
+        <w:spacing w:after="60"/>
+      </w:pPr>
+      <w:r>
+        <w:rPr>
+          <w:rFonts w:ascii="Geist Sans" w:cs="Geist Sans" w:eastAsia="Geist Sans" w:hAnsi="Geist Sans"/>
+          <w:color w:val="1A1A2E"/>
+          <w:sz w:val="22"/>
+          <w:szCs w:val="22"/>
+        </w:rPr>
+        <w:t xml:space="preserve">Cloudflare (аккаунт outmilker@gmail.com, Free план) — CDN, DNS, прокси для РФ</w:t>
+      </w:r>
+    </w:p>
+    <w:p>
+      <w:pPr>
+        <w:pStyle w:val="ListParagraph"/>
+        <w:numPr>
+          <w:ilvl w:val="0"/>
+          <w:numId w:val="1"/>
+        </w:numPr>
+        <w:spacing w:after="60"/>
+      </w:pPr>
+      <w:r>
+        <w:rPr>
+          <w:rFonts w:ascii="Geist Sans" w:cs="Geist Sans" w:eastAsia="Geist Sans" w:hAnsi="Geist Sans"/>
+          <w:color w:val="1A1A2E"/>
+          <w:sz w:val="22"/>
+          <w:szCs w:val="22"/>
+        </w:rPr>
+        <w:t xml:space="preserve">reg.ru — регистратор домена outmilk.online</w:t>
+      </w:r>
+    </w:p>
+    <w:p>
+      <w:pPr>
+        <w:spacing w:after="60" w:before="0"/>
+      </w:pPr>
+    </w:p>
+    <w:p>
+      <w:pPr>
+        <w:spacing w:after="120" w:before="0"/>
+      </w:pPr>
+      <w:r>
+        <w:rPr>
+          <w:rFonts w:ascii="Geist Sans" w:cs="Geist Sans" w:eastAsia="Geist Sans" w:hAnsi="Geist Sans"/>
+          <w:b/>
+          <w:bCs/>
+          <w:color w:val="1A1A2E"/>
+          <w:sz w:val="22"/>
+          <w:szCs w:val="22"/>
+        </w:rPr>
+        <w:t xml:space="preserve">Схема связей:</w:t>
+      </w:r>
+    </w:p>
+    <w:p>
+      <w:pPr>
+        <w:pBdr>
+          <w:top w:val="single" w:color="E5E5F0" w:sz="1"/>
+          <w:bottom w:val="single" w:color="E5E5F0" w:sz="1"/>
+          <w:left w:val="single" w:color="FF4D2D" w:sz="4"/>
+          <w:right w:val="single" w:color="E5E5F0" w:sz="1"/>
+        </w:pBdr>
+        <w:shd w:fill="F5F5FA" w:val="clear"/>
+        <w:spacing w:after="100" w:before="100"/>
+        <w:ind w:left="431" w:right="431"/>
+      </w:pPr>
+      <w:r>
+        <w:rPr>
+          <w:rFonts w:ascii="Geist Sans" w:cs="Geist Sans" w:eastAsia="Geist Sans" w:hAnsi="Geist Sans"/>
+          <w:color w:val="1A1A2E"/>
+          <w:sz w:val="20"/>
+          <w:szCs w:val="20"/>
+        </w:rPr>
+        <w:t xml:space="preserve">Браузер → naranja.outmilk.online → Cloudflare → Vercel → Supabase</w:t>
+      </w:r>
+    </w:p>
+    <w:p>
+      <w:pPr>
+        <w:spacing w:after="60" w:before="0"/>
+      </w:pPr>
+    </w:p>
+    <w:p>
+      <w:pPr>
+        <w:pStyle w:val="ListParagraph"/>
+        <w:numPr>
+          <w:ilvl w:val="0"/>
+          <w:numId w:val="1"/>
+        </w:numPr>
+        <w:spacing w:after="60"/>
+      </w:pPr>
+      <w:r>
+        <w:rPr>
+          <w:rFonts w:ascii="Geist Sans" w:cs="Geist Sans" w:eastAsia="Geist Sans" w:hAnsi="Geist Sans"/>
+          <w:color w:val="1A1A2E"/>
+          <w:sz w:val="22"/>
+          <w:szCs w:val="22"/>
+        </w:rPr>
+        <w:t xml:space="preserve">DNS: Cloudflare (adel.ns.cloudflare.com / ben.ns.cloudflare.com) — NS-серверы домена outmilk.online</w:t>
+      </w:r>
+    </w:p>
+    <w:p>
+      <w:pPr>
+        <w:pStyle w:val="ListParagraph"/>
+        <w:numPr>
+          <w:ilvl w:val="0"/>
+          <w:numId w:val="1"/>
+        </w:numPr>
+        <w:spacing w:after="60"/>
+      </w:pPr>
+      <w:r>
+        <w:rPr>
+          <w:rFonts w:ascii="Geist Sans" w:cs="Geist Sans" w:eastAsia="Geist Sans" w:hAnsi="Geist Sans"/>
+          <w:color w:val="1A1A2E"/>
+          <w:sz w:val="22"/>
+          <w:szCs w:val="22"/>
+        </w:rPr>
+        <w:t xml:space="preserve">GitHub push в main → Vercel авто-деплой</w:t>
+      </w:r>
+    </w:p>
+    <w:p>
+      <w:pPr>
+        <w:pStyle w:val="ListParagraph"/>
+        <w:numPr>
+          <w:ilvl w:val="0"/>
+          <w:numId w:val="1"/>
+        </w:numPr>
+        <w:spacing w:after="60"/>
+      </w:pPr>
+      <w:r>
+        <w:rPr>
+          <w:rFonts w:ascii="Geist Sans" w:cs="Geist Sans" w:eastAsia="Geist Sans" w:hAnsi="Geist Sans"/>
+          <w:color w:val="1A1A2E"/>
+          <w:sz w:val="22"/>
+          <w:szCs w:val="22"/>
+        </w:rPr>
+        <w:t xml:space="preserve">Vercel → Supabase по URL + anon key + service role key (переменные окружения)</w:t>
+      </w:r>
+    </w:p>
+    <w:p>
+      <w:pPr>
+        <w:pStyle w:val="ListParagraph"/>
+        <w:numPr>
+          <w:ilvl w:val="0"/>
+          <w:numId w:val="1"/>
+        </w:numPr>
+        <w:spacing w:after="60"/>
+      </w:pPr>
+      <w:r>
+        <w:rPr>
+          <w:rFonts w:ascii="Geist Sans" w:cs="Geist Sans" w:eastAsia="Geist Sans" w:hAnsi="Geist Sans"/>
+          <w:color w:val="1A1A2E"/>
+          <w:sz w:val="22"/>
+          <w:szCs w:val="22"/>
+        </w:rPr>
+        <w:t xml:space="preserve">Cloudflare → Vercel: CNAME naranja → cname.vercel-dns.com</w:t>
+      </w:r>
+    </w:p>
+    <w:p>
+      <w:pPr>
+        <w:pStyle w:val="ListParagraph"/>
+        <w:numPr>
+          <w:ilvl w:val="0"/>
+          <w:numId w:val="1"/>
+        </w:numPr>
+        <w:spacing w:after="60"/>
+      </w:pPr>
+      <w:r>
+        <w:rPr>
+          <w:rFonts w:ascii="Geist Sans" w:cs="Geist Sans" w:eastAsia="Geist Sans" w:hAnsi="Geist Sans"/>
+          <w:color w:val="1A1A2E"/>
+          <w:sz w:val="22"/>
+          <w:szCs w:val="22"/>
+        </w:rPr>
+        <w:t xml:space="preserve">Cloudflare → GitHub Pages: CNAME tvhamsters → outmilker1978.github.io</w:t>
+      </w:r>
+    </w:p>
+    <w:p>
+      <w:pPr>
+        <w:spacing w:after="60" w:before="0"/>
+      </w:pPr>
+    </w:p>
+    <w:p>
+      <w:pPr>
+        <w:spacing w:after="120" w:before="0"/>
+      </w:pPr>
+      <w:r>
+        <w:rPr>
+          <w:rFonts w:ascii="Geist Sans" w:cs="Geist Sans" w:eastAsia="Geist Sans" w:hAnsi="Geist Sans"/>
+          <w:b/>
+          <w:bCs/>
+          <w:color w:val="1A1A2E"/>
+          <w:sz w:val="22"/>
+          <w:szCs w:val="22"/>
+        </w:rPr>
+        <w:t xml:space="preserve">Переменные окружения (Vercel):</w:t>
+      </w:r>
+    </w:p>
+    <w:p>
+      <w:pPr>
+        <w:pStyle w:val="ListParagraph"/>
+        <w:numPr>
+          <w:ilvl w:val="0"/>
+          <w:numId w:val="1"/>
+        </w:numPr>
+        <w:spacing w:after="60"/>
+      </w:pPr>
+      <w:r>
+        <w:rPr>
+          <w:rFonts w:ascii="Geist Sans" w:cs="Geist Sans" w:eastAsia="Geist Sans" w:hAnsi="Geist Sans"/>
+          <w:color w:val="1A1A2E"/>
+          <w:sz w:val="22"/>
+          <w:szCs w:val="22"/>
+        </w:rPr>
+        <w:t xml:space="preserve">NEXT_PUBLIC_SUPABASE_URL — URL проекта Supabase</w:t>
+      </w:r>
+    </w:p>
+    <w:p>
+      <w:pPr>
+        <w:pStyle w:val="ListParagraph"/>
+        <w:numPr>
+          <w:ilvl w:val="0"/>
+          <w:numId w:val="1"/>
+        </w:numPr>
+        <w:spacing w:after="60"/>
+      </w:pPr>
+      <w:r>
+        <w:rPr>
+          <w:rFonts w:ascii="Geist Sans" w:cs="Geist Sans" w:eastAsia="Geist Sans" w:hAnsi="Geist Sans"/>
+          <w:color w:val="1A1A2E"/>
+          <w:sz w:val="22"/>
+          <w:szCs w:val="22"/>
+        </w:rPr>
+        <w:t xml:space="preserve">NEXT_PUBLIC_SUPABASE_ANON_KEY — публичный ключ Supabase</w:t>
+      </w:r>
+    </w:p>
+    <w:p>
+      <w:pPr>
+        <w:pStyle w:val="ListParagraph"/>
+        <w:numPr>
+          <w:ilvl w:val="0"/>
+          <w:numId w:val="1"/>
+        </w:numPr>
+        <w:spacing w:after="60"/>
+      </w:pPr>
+      <w:r>
+        <w:rPr>
+          <w:rFonts w:ascii="Geist Sans" w:cs="Geist Sans" w:eastAsia="Geist Sans" w:hAnsi="Geist Sans"/>
+          <w:color w:val="1A1A2E"/>
+          <w:sz w:val="22"/>
+          <w:szCs w:val="22"/>
+        </w:rPr>
+        <w:t xml:space="preserve">SUPABASE_SERVICE_ROLE_KEY — сервисный ключ (обходит RLS)</w:t>
+      </w:r>
+    </w:p>
+    <w:p>
+      <w:pPr>
+        <w:pStyle w:val="ListParagraph"/>
+        <w:numPr>
+          <w:ilvl w:val="0"/>
+          <w:numId w:val="1"/>
+        </w:numPr>
+        <w:spacing w:after="60"/>
+      </w:pPr>
+      <w:r>
+        <w:rPr>
+          <w:rFonts w:ascii="Geist Sans" w:cs="Geist Sans" w:eastAsia="Geist Sans" w:hAnsi="Geist Sans"/>
+          <w:color w:val="1A1A2E"/>
+          <w:sz w:val="22"/>
+          <w:szCs w:val="22"/>
+        </w:rPr>
+        <w:t xml:space="preserve">NEXT_PUBLIC_SITE_URL — https://naranja.outmilk.online (редиректы)</w:t>
+      </w:r>
+    </w:p>
+    <w:p>
+      <w:pPr>
+        <w:pStyle w:val="ListParagraph"/>
+        <w:numPr>
+          <w:ilvl w:val="0"/>
+          <w:numId w:val="1"/>
+        </w:numPr>
+        <w:spacing w:after="60"/>
+      </w:pPr>
+      <w:r>
+        <w:rPr>
+          <w:rFonts w:ascii="Geist Sans" w:cs="Geist Sans" w:eastAsia="Geist Sans" w:hAnsi="Geist Sans"/>
+          <w:color w:val="1A1A2E"/>
+          <w:sz w:val="22"/>
+          <w:szCs w:val="22"/>
+        </w:rPr>
+        <w:t xml:space="preserve">YANDEX_API_KEY — ключ Yandex Translate API (AI Studio)</w:t>
+      </w:r>
+    </w:p>
+    <w:p>
+      <w:pPr>
+        <w:pStyle w:val="ListParagraph"/>
+        <w:numPr>
+          <w:ilvl w:val="0"/>
+          <w:numId w:val="1"/>
+        </w:numPr>
+        <w:spacing w:after="60"/>
+      </w:pPr>
+      <w:r>
+        <w:rPr>
+          <w:rFonts w:ascii="Geist Sans" w:cs="Geist Sans" w:eastAsia="Geist Sans" w:hAnsi="Geist Sans"/>
+          <w:color w:val="1A1A2E"/>
+          <w:sz w:val="22"/>
+          <w:szCs w:val="22"/>
+        </w:rPr>
+        <w:t xml:space="preserve">YANDEX_FOLDER_ID — ID каталога Yandex Cloud</w:t>
       </w:r>
     </w:p>
     <w:p>

</xml_diff>